<commit_message>
docs(uml+documento): alinear el despliegue con la infraestructura clinica
El diagrama de despliegue seguia declarando erp_calzado_net,
erp_calzado_pgdata, erp_calzado_storage y una location /storage/ que el
barrido de infraestructura (780a753) ya habia eliminado. S12 exige que
cada diagrama corresponda al codigo entregado, y el .docx se habia
generado antes de ese barrido, asi que el entregable arrastraba el error.

- 13-despliegue.puml: red clinica_dental_net, volumen clinica_dental_pgdata,
  sin artefacto de storage y sin location /storage/ en la nota de nginx.
- 13-despliegue.png re-renderizado con el JAR de PlantUML.
- docs/Analisis Clinica Dental.docx regenerado: 245 parrafos, 4 tablas,
  13 figuras, todas dentro de los margenes (max 5.80 x 7.40 in).

Spec: odd/tasks/clinica-dental.md, S12, S16
</commit_message>
<xml_diff>
--- a/docs/Analisis Clinica Dental.docx
+++ b/docs/Analisis Clinica Dental.docx
@@ -752,7 +752,7 @@
           <w:color w:val="000000"/>
           <w:sz w:val="24"/>
         </w:rPr>
-        <w:t>La entrega se apoya en el código realmente presente en el repositorio. La interfaz expone las vistas activas del menú: Panel general, Pacientes, Historial clínico, Agenda de citas, Catálogo de tratamientos, Facturación y pagos, Mi cuenta. Las pantallas de Recordatorios permanecen como rutas reservadas en el router; sus servicios de API ya están escritos y activarlas no requiere cambios en el backend. Los recordatorios se despachan mediante un proceso programado con cadencia configurable y el correo se envía por SMTP configurable; cuando no hay servidor declarado, la bitácora registra el intento como simulado en lugar de fallar. Los diagramas UML que todavía no tienen PNG renderizado se detallan en las conclusiones y en las recomendaciones, sin ocultarlos en la narrativa del documento.</w:t>
+        <w:t>La entrega se apoya en el código realmente presente en el repositorio. La interfaz expone las vistas activas del menú: Panel general, Pacientes, Historial clínico, Agenda de citas, Catálogo de tratamientos, Facturación y pagos, Recordatorios, Mi cuenta. Todas las rutas declaradas en el router tienen su módulo de pantalla entregado. Los recordatorios se despachan mediante un proceso programado con cadencia configurable y el correo se envía por SMTP configurable; cuando no hay servidor declarado, la bitácora registra el intento como simulado en lugar de fallar. Los diagramas UML que todavía no tienen PNG renderizado se detallan en las conclusiones y en las recomendaciones, sin ocultarlos en la narrativa del documento.</w:t>
       </w:r>
     </w:p>
     <w:p>
@@ -3739,7 +3739,7 @@
       <w:r>
         <w:drawing>
           <wp:inline xmlns:a="http://schemas.openxmlformats.org/drawingml/2006/main" xmlns:pic="http://schemas.openxmlformats.org/drawingml/2006/picture">
-            <wp:extent cx="5303520" cy="4185574"/>
+            <wp:extent cx="5303520" cy="5430635"/>
             <wp:docPr id="13" name="Picture 13"/>
             <wp:cNvGraphicFramePr>
               <a:graphicFrameLocks noChangeAspect="1"/>
@@ -3760,7 +3760,7 @@
                   <pic:spPr>
                     <a:xfrm>
                       <a:off x="0" y="0"/>
-                      <a:ext cx="5303520" cy="4185574"/>
+                      <a:ext cx="5303520" cy="5430635"/>
                     </a:xfrm>
                     <a:prstGeom prst="rect"/>
                   </pic:spPr>

</xml_diff>